<commit_message>
feat(artisan): add phone number verification via Firebase Auth before shop launch
</commit_message>
<xml_diff>
--- a/public/docs/Giftisan_Artisan_Partnership_Agreement_2026_v2_AR.docx
+++ b/public/docs/Giftisan_Artisan_Partnership_Agreement_2026_v2_AR.docx
@@ -229,7 +229,7 @@
                 <w:sz w:val="18"/>
                 <w:rtl/>
               </w:rPr>
-              <w:t>0% عمولة للمؤسسين</w:t>
+              <w:t>عمولة تصاعدية (0% – 8% – 10%)</w:t>
             </w:r>
           </w:p>
         </w:tc>
@@ -265,7 +265,7 @@
                 <w:sz w:val="18"/>
                 <w:rtl/>
               </w:rPr>
-              <w:t>عدم اقتطاع أي عمولة بيع طوال عام 2026.</w:t>
+              <w:t>0% أول 6 أشهر، 8% ثاني 6 أشهر، 10% ثالث 6 أشهر وما بعدها.</w:t>
             </w:r>
           </w:p>
         </w:tc>
@@ -301,7 +301,7 @@
                 <w:sz w:val="18"/>
                 <w:rtl/>
               </w:rPr>
-              <w:t>يحتفظ الحرفي بكامل أرباحه الصافية دون أي عمولة منصة طوال برنامج المؤسسين.</w:t>
+              <w:t>تطبق المنصة هيكل عمولة متدرج وشفاف بحسب عمر حساب المتجر مع شمولية رسوم الدفع وبدون مصاريف خفية.</w:t>
             </w:r>
           </w:p>
         </w:tc>
@@ -790,7 +790,7 @@
           <w:sz w:val="30"/>
           <w:rtl/>
         </w:rPr>
-        <w:t>البند الخامس: التسعير، عمولة 0%، ودورة التحويل المالي</w:t>
+        <w:t>البند الخامس: التسعير، هيكل العمولة المتدرج، ودورة التحويل المالي</w:t>
       </w:r>
     </w:p>
     <w:p>
@@ -806,7 +806,7 @@
           <w:sz w:val="22"/>
           <w:rtl/>
         </w:rPr>
-        <w:t>يحدد الحرفي أسعار بيع منتجاته بحرية. ويحصل الحرفيون المؤسسون على نسبة العمولة الظاهرة في لوحة التحكم، وهي حالياً 0% لبرنامج المؤسسين لعام 2026. يظهر في كشف رصيد تفصيلي كل بيع ورسوم واسترجاع واحتياطي وتحويل مالي. يصبح صافي الأرباح متاحاً للسحب بعد 7 أيام عمل من تأكيد التسليم، وفقاً لقواعد فترة الحجز والاسترجاع ومراجعة الاحتيال المعلنة. تلتزم جيفتيزان بإشعار مسبق عند أي تغيير جوهري في الرسوم أو قواعد التحويل، ويطبق التغيير من تاريخ سريانه المعلن فقط.</w:t>
+        <w:t>يحدد الحرفي أسعار بيع منتجاته بحرية. وتطبق المنصة هيكل عمولة متدرج وشفاف بناءً على عمر حساب متجر الحرفي: 0% عمولة للمنصة طوال أول 6 أشهر (الشهور 1–6)، و8% عمولة للمنصة خلال ثاني 6 أشهر (الشهور 7–12)، و10% عمولة للمنصة لثالث 6 أشهر وما بعدها (الشهر 13 وما يليه) من مبيعات كل منتج للحرفي. يظهر في كشف رصيد تفصيلي كل بيع ورسوم واسترجاع واحتياطي وتحويل مالي. يصبح صافي الأرباح متاحاً للسحب بعد 7 أيام عمل من تأكيد التسليم، وفقاً لقواعد فترة الحجز والاسترجاع ومراجعة الاحتيال المعلنة. تلتزم جيفتيزان بإشعار مسبق عند أي تغيير جوهري في الرسوم أو قواعد التحويل، ويطبق التغيير من تاريخ سريانه المعلن فقط.</w:t>
       </w:r>
     </w:p>
     <w:p>

</xml_diff>